<commit_message>
docs: agregar Anexo C (Costos) y Anexo D (Resguardo de Datos)
</commit_message>
<xml_diff>
--- a/Desarrollo.docx
+++ b/Desarrollo.docx
@@ -1854,6 +1854,104 @@
         </w:rPr>
         <w:br/>
         <w:t>Nota: Todas las dependencias utilizadas son de código abierto y compatibles con uso académico y comercial. El proyecto Agro-Colab se distribuye bajo licencia MIT.</w:t>
+      </w:r>
+    </w:p>
+    <w:p>
+      <w:r>
+        <w:rPr>
+          <w:b/>
+          <w:sz w:val="28"/>
+        </w:rPr>
+        <w:br/>
+        <w:t>Anexo C: Costos del Proyecto</w:t>
+      </w:r>
+    </w:p>
+    <w:p>
+      <w:r>
+        <w:t>El proyecto Agro-Colab se desarrolla bajo un modelo de costos mínimos, aprovechando herramientas gratuitas y de código abierto:</w:t>
+        <w:br/>
+        <w:br/>
+        <w:t>Infraestructura:</w:t>
+        <w:br/>
+        <w:t>- Frontend: Sin costo (archivos estáticos servidos con Python http.server)</w:t>
+        <w:br/>
+        <w:t>- Backend: Sin costo (FastAPI + Uvicorn, herramientas open source)</w:t>
+        <w:br/>
+        <w:t>- Base de datos: Sin costo en esta etapa (estructuras en memoria)</w:t>
+        <w:br/>
+        <w:t>- Dominio: No aplica en prototipo</w:t>
+        <w:br/>
+        <w:t>- Hosting: No aplica en prototipo (desarrollo local)</w:t>
+        <w:br/>
+        <w:br/>
+        <w:t>Herramientas de desarrollo:</w:t>
+        <w:br/>
+        <w:t>- Visual Studio Code: Gratuito</w:t>
+        <w:br/>
+        <w:t>- Git y GitHub: Gratuito</w:t>
+        <w:br/>
+        <w:t>- Tailwind CSS: Gratuito (CDN)</w:t>
+        <w:br/>
+        <w:t>- Font Awesome: Gratuito (CDN)</w:t>
+        <w:br/>
+        <w:br/>
+        <w:t>Costo total del prototipo: $0 CLP</w:t>
+        <w:br/>
+        <w:br/>
+        <w:t>Para una versión en producción, los costos estimados serían:</w:t>
+        <w:br/>
+        <w:t>- Hosting (VPS): ~$5.000 CLP/mes</w:t>
+        <w:br/>
+        <w:t>- Dominio: ~$15.000 CLP/año</w:t>
+        <w:br/>
+        <w:t>- SSL: Gratuito (Let's Encrypt)</w:t>
+        <w:br/>
+        <w:t>- Base de datos en la nube: ~$10.000 CLP/mes</w:t>
+      </w:r>
+    </w:p>
+    <w:p>
+      <w:r>
+        <w:rPr>
+          <w:b/>
+          <w:sz w:val="28"/>
+        </w:rPr>
+        <w:br/>
+        <w:t>Anexo D: Resguardo de Datos y Cumplimiento Normativo</w:t>
+      </w:r>
+    </w:p>
+    <w:p>
+      <w:r>
+        <w:t>A partir del 1 de diciembre de 2026, entra en vigor la nueva Ley de Protección de Datos Personales en Chile, que establece requisitos más estrictos para el manejo de información personal de los usuarios.</w:t>
+        <w:br/>
+        <w:br/>
+        <w:t>Agro-Colab se compromete a cumplir con esta normativa. Las medidas implementadas y planificadas son:</w:t>
+        <w:br/>
+        <w:br/>
+        <w:t>Medidas actuales:</w:t>
+        <w:br/>
+        <w:t>- Los datos de sesión se almacenan únicamente en el navegador del usuario (localStorage)</w:t>
+        <w:br/>
+        <w:t>- No se recopilan datos personales sensibles más allá de los necesarios para el servicio</w:t>
+        <w:br/>
+        <w:t>- El acceso a la información está protegido por autenticación de usuarios</w:t>
+        <w:br/>
+        <w:t>- No se comparten datos con terceros</w:t>
+        <w:br/>
+        <w:br/>
+        <w:t>Medidas planificadas para el Hito 2:</w:t>
+        <w:br/>
+        <w:t>- Implementación de cifrado de datos sensibles en tránsito y en reposo</w:t>
+        <w:br/>
+        <w:t>- Sistema de consentimiento explícito para el tratamiento de datos</w:t>
+        <w:br/>
+        <w:t>- Mecanismo para que los usuarios soliciten la eliminación de sus datos</w:t>
+        <w:br/>
+        <w:t>- Registro de accesos y auditorías de seguridad</w:t>
+        <w:br/>
+        <w:t>- Designación de un encargado de protección de datos</w:t>
+        <w:br/>
+        <w:br/>
+        <w:t>La plataforma está diseñada con un enfoque de privacidad desde el diseño (privacy by design), minimizando la recopilación de datos y maximizando el control del usuario sobre su información.</w:t>
       </w:r>
     </w:p>
     <w:p/>

</xml_diff>